<commit_message>
feat: extract shared schemas/onboarding logic, wire mobile to shared package
- Move auth and onboarding Zod schemas, types, constants, and date
  helpers from frontend/ into shared/, with frontend files now
  re-exporting for backward compatibility (no consumer imports changed)
- Fix zod resolving to a mismatched version outside the repo by pinning
  it as a dependency at the workspace root
- Configure mobile's Metro bundler and tsconfig to resolve @shared/*
  across the monorepo boundary (path aliases alone aren't enough for
  Metro); verified with a real expo export bundle, not just tsc
- Link mobile/ to the existing EAS project and bump production build
  memory (routine expo export side effect)
- Update migration checklist: mark Phase 1 items done, move the Play
  Store signing-key check to the release phase per founder decision,
  mark shared-logic extraction complete

Co-Authored-By: Claude Sonnet 5 <noreply@anthropic.com>
</commit_message>
<xml_diff>
--- a/docs/Rove-Health-RN-Migration-Intern-Plan.docx
+++ b/docs/Rove-Health-RN-Migration-Intern-Plan.docx
@@ -1669,6 +1669,34 @@
     </w:p>
     <w:p>
       <w:pPr>
+        <w:pStyle w:val="ListParagraph"/>
+        <w:numPr>
+          <w:ilvl w:val="0"/>
+          <w:numId w:val="2"/>
+        </w:numPr>
+        <w:spacing w:after="60" w:line="280"/>
+      </w:pPr>
+      <w:r>
+        <w:rPr>
+          <w:b/>
+          <w:bCs/>
+          <w:color w:val="2B2B2B"/>
+          <w:sz w:val="21"/>
+          <w:szCs w:val="21"/>
+        </w:rPr>
+        <w:t xml:space="preserve">Play Store signing-key verification (Item 3) moved from Phase 1 to Phase 6 </w:t>
+      </w:r>
+      <w:r>
+        <w:rPr>
+          <w:color w:val="2B2B2B"/>
+          <w:sz w:val="21"/>
+          <w:szCs w:val="21"/>
+        </w:rPr>
+        <w:t xml:space="preserve">— founder’s explicit decision (2026-07-19). Originally scheduled for week 1 precisely so a signing problem would be caught with weeks of runway to fix it; doing it right before release instead means any issue found there has no buffer and could delay the release date directly. Accepted knowingly.</w:t>
+      </w:r>
+    </w:p>
+    <w:p>
+      <w:pPr>
         <w:pStyle w:val="Heading1"/>
         <w:spacing w:after="140" w:before="320"/>
       </w:pPr>
@@ -1840,11 +1868,21 @@
       </w:pPr>
       <w:r>
         <w:rPr>
-          <w:color w:val="2B2B2B"/>
-          <w:sz w:val="21"/>
-          <w:szCs w:val="21"/>
-        </w:rPr>
-        <w:t xml:space="preserve">A code audit found more done than expected. Do not redo any of the following:</w:t>
+          <w:b/>
+          <w:bCs/>
+          <w:color w:val="2B2B2B"/>
+          <w:sz w:val="21"/>
+          <w:szCs w:val="21"/>
+        </w:rPr>
+        <w:t xml:space="preserve">Phase 1 is done except Item 3 (moved to Phase 6 — see Decisions log). </w:t>
+      </w:r>
+      <w:r>
+        <w:rPr>
+          <w:color w:val="2B2B2B"/>
+          <w:sz w:val="21"/>
+          <w:szCs w:val="21"/>
+        </w:rPr>
+        <w:t xml:space="preserve">Do not redo any of the following:</w:t>
       </w:r>
     </w:p>
     <w:tbl>
@@ -2071,7 +2109,7 @@
                 <w:sz w:val="20"/>
                 <w:szCs w:val="20"/>
               </w:rPr>
-              <w:t xml:space="preserve">6 UI kit components</w:t>
+              <w:t xml:space="preserve">Item 1 — Session persistence</w:t>
             </w:r>
           </w:p>
         </w:tc>
@@ -2100,7 +2138,7 @@
                 <w:sz w:val="20"/>
                 <w:szCs w:val="20"/>
               </w:rPr>
-              <w:t xml:space="preserve">Button, Card, Input, Badge, Avatar, AnimatedBackground in mobile/src/components/ui/</w:t>
+              <w:t xml:space="preserve">mobile/src/app/index.tsx checks the real Supabase session, shows a loading state, redirects correctly</w:t>
             </w:r>
           </w:p>
         </w:tc>
@@ -2131,7 +2169,7 @@
                 <w:sz w:val="20"/>
                 <w:szCs w:val="20"/>
               </w:rPr>
-              <w:t xml:space="preserve">Brand fonts loaded</w:t>
+              <w:t xml:space="preserve">Item 2 — Deep links for password reset</w:t>
             </w:r>
           </w:p>
         </w:tc>
@@ -2160,7 +2198,7 @@
                 <w:sz w:val="20"/>
                 <w:szCs w:val="20"/>
               </w:rPr>
-              <w:t xml:space="preserve">Inter, Outfit, Cormorant Garamond wired into the app layout</w:t>
+              <w:t xml:space="preserve">mobile/src/app/(auth)/reset-password.tsx parses the incoming email link and sets the session</w:t>
             </w:r>
           </w:p>
         </w:tc>
@@ -2191,7 +2229,7 @@
                 <w:sz w:val="20"/>
                 <w:szCs w:val="20"/>
               </w:rPr>
-              <w:t xml:space="preserve">Deep link scheme registered</w:t>
+              <w:t xml:space="preserve">Item 4 — Rest of the UI kit</w:t>
             </w:r>
           </w:p>
         </w:tc>
@@ -2220,7 +2258,127 @@
                 <w:sz w:val="20"/>
                 <w:szCs w:val="20"/>
               </w:rPr>
-              <w:t xml:space="preserve">rovehealth:// is set in app.json but not yet handled anywhere — see Item 2 below</w:t>
+              <w:t xml:space="preserve">Accordion, BottomSheet, Dialog, Select, Skeleton, SegmentedControl built, sonner-native added for toasts, all shown in mobile/src/app/gallery.tsx</w:t>
+            </w:r>
+          </w:p>
+        </w:tc>
+      </w:tr>
+      <w:tr>
+        <w:tc>
+          <w:tcPr>
+            <w:tcW w:type="dxa" w:w="2600"/>
+            <w:tcBorders>
+              <w:top w:val="single" w:color="CFC8BC" w:sz="4"/>
+              <w:left w:val="single" w:color="CFC8BC" w:sz="4"/>
+              <w:bottom w:val="single" w:color="CFC8BC" w:sz="4"/>
+              <w:right w:val="single" w:color="CFC8BC" w:sz="4"/>
+            </w:tcBorders>
+            <w:tcMar>
+              <w:top w:type="dxa" w:w="80"/>
+              <w:left w:type="dxa" w:w="120"/>
+              <w:bottom w:type="dxa" w:w="80"/>
+              <w:right w:type="dxa" w:w="120"/>
+            </w:tcMar>
+          </w:tcPr>
+          <w:p>
+            <w:r>
+              <w:rPr>
+                <w:b w:val="false"/>
+                <w:bCs w:val="false"/>
+                <w:color w:val="2B2B2B"/>
+                <w:sz w:val="20"/>
+                <w:szCs w:val="20"/>
+              </w:rPr>
+              <w:t xml:space="preserve">Item 5 — Theme token completeness</w:t>
+            </w:r>
+          </w:p>
+        </w:tc>
+        <w:tc>
+          <w:tcPr>
+            <w:tcW w:type="dxa" w:w="6426"/>
+            <w:tcBorders>
+              <w:top w:val="single" w:color="CFC8BC" w:sz="4"/>
+              <w:left w:val="single" w:color="CFC8BC" w:sz="4"/>
+              <w:bottom w:val="single" w:color="CFC8BC" w:sz="4"/>
+              <w:right w:val="single" w:color="CFC8BC" w:sz="4"/>
+            </w:tcBorders>
+            <w:tcMar>
+              <w:top w:type="dxa" w:w="80"/>
+              <w:left w:type="dxa" w:w="120"/>
+              <w:bottom w:type="dxa" w:w="80"/>
+              <w:right w:type="dxa" w:w="120"/>
+            </w:tcMar>
+          </w:tcPr>
+          <w:p>
+            <w:r>
+              <w:rPr>
+                <w:b w:val="false"/>
+                <w:bCs w:val="false"/>
+                <w:color w:val="2B2B2B"/>
+                <w:sz w:val="20"/>
+                <w:szCs w:val="20"/>
+              </w:rPr>
+              <w:t xml:space="preserve">All four phase colors + paper background present in mobile/tailwind.config.js</w:t>
+            </w:r>
+          </w:p>
+        </w:tc>
+      </w:tr>
+      <w:tr>
+        <w:tc>
+          <w:tcPr>
+            <w:tcW w:type="dxa" w:w="2600"/>
+            <w:tcBorders>
+              <w:top w:val="single" w:color="CFC8BC" w:sz="4"/>
+              <w:left w:val="single" w:color="CFC8BC" w:sz="4"/>
+              <w:bottom w:val="single" w:color="CFC8BC" w:sz="4"/>
+              <w:right w:val="single" w:color="CFC8BC" w:sz="4"/>
+            </w:tcBorders>
+            <w:tcMar>
+              <w:top w:type="dxa" w:w="80"/>
+              <w:left w:type="dxa" w:w="120"/>
+              <w:bottom w:type="dxa" w:w="80"/>
+              <w:right w:type="dxa" w:w="120"/>
+            </w:tcMar>
+          </w:tcPr>
+          <w:p>
+            <w:r>
+              <w:rPr>
+                <w:b w:val="false"/>
+                <w:bCs w:val="false"/>
+                <w:color w:val="2B2B2B"/>
+                <w:sz w:val="20"/>
+                <w:szCs w:val="20"/>
+              </w:rPr>
+              <w:t xml:space="preserve">Brand fonts loaded</w:t>
+            </w:r>
+          </w:p>
+        </w:tc>
+        <w:tc>
+          <w:tcPr>
+            <w:tcW w:type="dxa" w:w="6426"/>
+            <w:tcBorders>
+              <w:top w:val="single" w:color="CFC8BC" w:sz="4"/>
+              <w:left w:val="single" w:color="CFC8BC" w:sz="4"/>
+              <w:bottom w:val="single" w:color="CFC8BC" w:sz="4"/>
+              <w:right w:val="single" w:color="CFC8BC" w:sz="4"/>
+            </w:tcBorders>
+            <w:tcMar>
+              <w:top w:type="dxa" w:w="80"/>
+              <w:left w:type="dxa" w:w="120"/>
+              <w:bottom w:type="dxa" w:w="80"/>
+              <w:right w:type="dxa" w:w="120"/>
+            </w:tcMar>
+          </w:tcPr>
+          <w:p>
+            <w:r>
+              <w:rPr>
+                <w:b w:val="false"/>
+                <w:bCs w:val="false"/>
+                <w:color w:val="2B2B2B"/>
+                <w:sz w:val="20"/>
+                <w:szCs w:val="20"/>
+              </w:rPr>
+              <w:t xml:space="preserve">Inter, Outfit, Cormorant Garamond wired into the app layout</w:t>
             </w:r>
           </w:p>
         </w:tc>
@@ -2246,7 +2404,7 @@
           <w:sz w:val="21"/>
           <w:szCs w:val="21"/>
         </w:rPr>
-        <w:t xml:space="preserve">(confirmed by reading the code directly): session persistence, the deep-link handler, the rest of the UI kit, all 26 app screens, both risk spikes, the shared-logic package, and everything in polish, testing, and release.</w:t>
+        <w:t xml:space="preserve">(confirmed by reading the code directly): Item 3 (signing-key verification, deliberately deferred to Phase 6), all 26 app screens, both risk spikes, the shared-logic package, and everything in polish, testing, and release.</w:t>
       </w:r>
     </w:p>
     <w:p>
@@ -2556,7 +2714,7 @@
           <w:sz w:val="23"/>
           <w:szCs w:val="23"/>
         </w:rPr>
-        <w:t xml:space="preserve">☐  1. Session persistence + app entry logic</w:t>
+        <w:t xml:space="preserve">☑  1. Session persistence + app entry logic  — DONE</w:t>
       </w:r>
     </w:p>
     <w:p>
@@ -2667,7 +2825,7 @@
           <w:sz w:val="23"/>
           <w:szCs w:val="23"/>
         </w:rPr>
-        <w:t xml:space="preserve">☐  2. Deep links for password reset</w:t>
+        <w:t xml:space="preserve">☑  2. Deep links for password reset  — DONE</w:t>
       </w:r>
     </w:p>
     <w:p>
@@ -2778,30 +2936,30 @@
           <w:sz w:val="23"/>
           <w:szCs w:val="23"/>
         </w:rPr>
-        <w:t xml:space="preserve">☐  3. Play Store signing-key verification — do this in week 1</w:t>
-      </w:r>
-    </w:p>
-    <w:p>
-      <w:pPr>
-        <w:spacing w:after="120" w:line="300"/>
-      </w:pPr>
-      <w:r>
-        <w:rPr>
-          <w:b/>
-          <w:bCs/>
-          <w:color w:val="2B2B2B"/>
-          <w:sz w:val="21"/>
-          <w:szCs w:val="21"/>
-        </w:rPr>
-        <w:t xml:space="preserve">Note: </w:t>
-      </w:r>
-      <w:r>
-        <w:rPr>
-          <w:color w:val="2B2B2B"/>
-          <w:sz w:val="21"/>
-          <w:szCs w:val="21"/>
-        </w:rPr>
-        <w:t xml:space="preserve">This is the one irreversible risk in the whole project.</w:t>
+        <w:t xml:space="preserve">☑  4. Rest of the UI kit  — DONE</w:t>
+      </w:r>
+    </w:p>
+    <w:p>
+      <w:pPr>
+        <w:spacing w:after="70" w:line="280"/>
+      </w:pPr>
+      <w:r>
+        <w:rPr>
+          <w:b/>
+          <w:bCs/>
+          <w:color w:val="2B2B2B"/>
+          <w:sz w:val="21"/>
+          <w:szCs w:val="21"/>
+        </w:rPr>
+        <w:t xml:space="preserve">Reference: </w:t>
+      </w:r>
+      <w:r>
+        <w:rPr>
+          <w:color w:val="2B2B2B"/>
+          <w:sz w:val="21"/>
+          <w:szCs w:val="21"/>
+        </w:rPr>
+        <w:t xml:space="preserve">Every component in frontend/src/components/ui/ is the source-of-truth list. Needed: Sheet/bottom-sheet, Dialog/Modal, Select/Dropdown, Toast, Accordion (see frontend/src/app/cycle-sync/tracker/components/TrackerAccordion.tsx), Skeleton, Tabs.</w:t>
       </w:r>
     </w:p>
     <w:p>
@@ -2824,7 +2982,7 @@
           <w:sz w:val="21"/>
           <w:szCs w:val="21"/>
         </w:rPr>
-        <w:t xml:space="preserve">Play Console → your app → Setup → App signing. Find the existing upload keystore for com.rovehealth.app.</w:t>
+        <w:t xml:space="preserve">Toasts → sonner-native, per the library mapping above.</w:t>
       </w:r>
     </w:p>
     <w:p>
@@ -2847,7 +3005,7 @@
           <w:sz w:val="21"/>
           <w:szCs w:val="21"/>
         </w:rPr>
-        <w:t xml:space="preserve">No code — verify, then back up the keystore file in two separate places.</w:t>
+        <w:t xml:space="preserve">One file per component in mobile/src/components/ui/, matching the visual style already set by Button.tsx and Card.tsx.</w:t>
       </w:r>
     </w:p>
     <w:p>
@@ -2870,7 +3028,7 @@
           <w:sz w:val="21"/>
           <w:szCs w:val="21"/>
         </w:rPr>
-        <w:t xml:space="preserve">A written note (shared with the founder) confirming where the keystore lives and that it is backed up twice.</w:t>
+        <w:t xml:space="preserve">A component-gallery demo screen shows every component, checked side-by-side against the web equivalent.</w:t>
       </w:r>
     </w:p>
     <w:p>
@@ -2889,7 +3047,7 @@
           <w:sz w:val="23"/>
           <w:szCs w:val="23"/>
         </w:rPr>
-        <w:t xml:space="preserve">☐  4. Rest of the UI kit</w:t>
+        <w:t xml:space="preserve">☑  5. Theme token completeness check  — DONE</w:t>
       </w:r>
     </w:p>
     <w:p>
@@ -2912,30 +3070,7 @@
           <w:sz w:val="21"/>
           <w:szCs w:val="21"/>
         </w:rPr>
-        <w:t xml:space="preserve">Every component in frontend/src/components/ui/ is the source-of-truth list. Needed: Sheet/bottom-sheet, Dialog/Modal, Select/Dropdown, Toast, Accordion (see frontend/src/app/cycle-sync/tracker/components/TrackerAccordion.tsx), Skeleton, Tabs.</w:t>
-      </w:r>
-    </w:p>
-    <w:p>
-      <w:pPr>
-        <w:spacing w:after="70" w:line="280"/>
-      </w:pPr>
-      <w:r>
-        <w:rPr>
-          <w:b/>
-          <w:bCs/>
-          <w:color w:val="2B2B2B"/>
-          <w:sz w:val="21"/>
-          <w:szCs w:val="21"/>
-        </w:rPr>
-        <w:t xml:space="preserve">Research: </w:t>
-      </w:r>
-      <w:r>
-        <w:rPr>
-          <w:color w:val="2B2B2B"/>
-          <w:sz w:val="21"/>
-          <w:szCs w:val="21"/>
-        </w:rPr>
-        <w:t xml:space="preserve">Toasts → sonner-native, per the library mapping in the main plan doc.</w:t>
+        <w:t xml:space="preserve">frontend/src/app/globals.css — especially the four phase colors (--phase-menstrual-rgb, --phase-follicular-rgb, --phase-ovulatory-rgb, --phase-luteal-rgb) and the paper background (#FAF9F6).</w:t>
       </w:r>
     </w:p>
     <w:p>
@@ -2958,7 +3093,7 @@
           <w:sz w:val="21"/>
           <w:szCs w:val="21"/>
         </w:rPr>
-        <w:t xml:space="preserve">One file per component in mobile/src/components/ui/, matching the visual style already set by Button.tsx and Card.tsx.</w:t>
+        <w:t xml:space="preserve">Compare against mobile/tailwind.config.js and add anything missing — the phase colors are the most likely gap, and every phase-aware screen in Phase 4 needs them.</w:t>
       </w:r>
     </w:p>
     <w:p>
@@ -2981,7 +3116,36 @@
           <w:sz w:val="21"/>
           <w:szCs w:val="21"/>
         </w:rPr>
-        <w:t xml:space="preserve">A component-gallery demo screen shows every component, checked side-by-side against the web equivalent.</w:t>
+        <w:t xml:space="preserve">A test screen renders all four phase colors and the paper background correctly on device.</w:t>
+      </w:r>
+    </w:p>
+    <w:p>
+      <w:pPr>
+        <w:pStyle w:val="Heading1"/>
+        <w:spacing w:after="140" w:before="320"/>
+      </w:pPr>
+      <w:r>
+        <w:rPr>
+          <w:b/>
+          <w:bCs/>
+          <w:color w:val="7A5C3E"/>
+          <w:sz w:val="30"/>
+          <w:szCs w:val="30"/>
+        </w:rPr>
+        <w:t xml:space="preserve">Phase 2 — Risk spikes</w:t>
+      </w:r>
+    </w:p>
+    <w:p>
+      <w:pPr>
+        <w:spacing w:after="120" w:line="300"/>
+      </w:pPr>
+      <w:r>
+        <w:rPr>
+          <w:color w:val="2B2B2B"/>
+          <w:sz w:val="21"/>
+          <w:szCs w:val="21"/>
+        </w:rPr>
+        <w:t xml:space="preserve">Can start alongside Phase 1 — these do not depend on the UI kit.</w:t>
       </w:r>
     </w:p>
     <w:p>
@@ -3000,30 +3164,30 @@
           <w:sz w:val="23"/>
           <w:szCs w:val="23"/>
         </w:rPr>
-        <w:t xml:space="preserve">☐  5. Theme token completeness check</w:t>
-      </w:r>
-    </w:p>
-    <w:p>
-      <w:pPr>
-        <w:spacing w:after="70" w:line="280"/>
-      </w:pPr>
-      <w:r>
-        <w:rPr>
-          <w:b/>
-          <w:bCs/>
-          <w:color w:val="2B2B2B"/>
-          <w:sz w:val="21"/>
-          <w:szCs w:val="21"/>
-        </w:rPr>
-        <w:t xml:space="preserve">Reference: </w:t>
-      </w:r>
-      <w:r>
-        <w:rPr>
-          <w:color w:val="2B2B2B"/>
-          <w:sz w:val="21"/>
-          <w:szCs w:val="21"/>
-        </w:rPr>
-        <w:t xml:space="preserve">frontend/src/app/globals.css — especially the four phase colors (--phase-menstrual-rgb, --phase-follicular-rgb, --phase-ovulatory-rgb, --phase-luteal-rgb) and the paper background (#FAF9F6).</w:t>
+        <w:t xml:space="preserve">☐  6. Voice spike — ElevenLabs in React Native</w:t>
+      </w:r>
+    </w:p>
+    <w:p>
+      <w:pPr>
+        <w:spacing w:after="70" w:line="280"/>
+      </w:pPr>
+      <w:r>
+        <w:rPr>
+          <w:b/>
+          <w:bCs/>
+          <w:color w:val="2B2B2B"/>
+          <w:sz w:val="21"/>
+          <w:szCs w:val="21"/>
+        </w:rPr>
+        <w:t xml:space="preserve">Research: </w:t>
+      </w:r>
+      <w:r>
+        <w:rPr>
+          <w:color w:val="2B2B2B"/>
+          <w:sz w:val="21"/>
+          <w:szCs w:val="21"/>
+        </w:rPr>
+        <w:t xml:space="preserve">@elevenlabs/react-native; mic permissions on iOS (via app.json ios.infoPlist) and Android; streaming audio playback in Expo.</w:t>
       </w:r>
     </w:p>
     <w:p>
@@ -3046,7 +3210,7 @@
           <w:sz w:val="21"/>
           <w:szCs w:val="21"/>
         </w:rPr>
-        <w:t xml:space="preserve">Compare against mobile/tailwind.config.js and add anything missing — the phase colors are the most likely gap, and every phase-aware screen in Phase 4 needs them.</w:t>
+        <w:t xml:space="preserve">A throwaway test screen that records/streams and plays back one exchange.</w:t>
       </w:r>
     </w:p>
     <w:p>
@@ -3069,36 +3233,7 @@
           <w:sz w:val="21"/>
           <w:szCs w:val="21"/>
         </w:rPr>
-        <w:t xml:space="preserve">A test screen renders all four phase colors and the paper background correctly on device.</w:t>
-      </w:r>
-    </w:p>
-    <w:p>
-      <w:pPr>
-        <w:pStyle w:val="Heading1"/>
-        <w:spacing w:after="140" w:before="320"/>
-      </w:pPr>
-      <w:r>
-        <w:rPr>
-          <w:b/>
-          <w:bCs/>
-          <w:color w:val="7A5C3E"/>
-          <w:sz w:val="30"/>
-          <w:szCs w:val="30"/>
-        </w:rPr>
-        <w:t xml:space="preserve">Phase 2 — Risk spikes</w:t>
-      </w:r>
-    </w:p>
-    <w:p>
-      <w:pPr>
-        <w:spacing w:after="120" w:line="300"/>
-      </w:pPr>
-      <w:r>
-        <w:rPr>
-          <w:color w:val="2B2B2B"/>
-          <w:sz w:val="21"/>
-          <w:szCs w:val="21"/>
-        </w:rPr>
-        <w:t xml:space="preserve">Can start alongside Phase 1 — these do not depend on the UI kit.</w:t>
+        <w:t xml:space="preserve">Works on a real phone. If it fails, write the fallback decision in the team plan doc (most likely: AI chat ships as an in-app webview) and flag it to the founder before Item 19 is claimed.</w:t>
       </w:r>
     </w:p>
     <w:p>
@@ -3117,30 +3252,30 @@
           <w:sz w:val="23"/>
           <w:szCs w:val="23"/>
         </w:rPr>
-        <w:t xml:space="preserve">☐  6. Voice spike — ElevenLabs in React Native</w:t>
-      </w:r>
-    </w:p>
-    <w:p>
-      <w:pPr>
-        <w:spacing w:after="70" w:line="280"/>
-      </w:pPr>
-      <w:r>
-        <w:rPr>
-          <w:b/>
-          <w:bCs/>
-          <w:color w:val="2B2B2B"/>
-          <w:sz w:val="21"/>
-          <w:szCs w:val="21"/>
-        </w:rPr>
-        <w:t xml:space="preserve">Research: </w:t>
-      </w:r>
-      <w:r>
-        <w:rPr>
-          <w:color w:val="2B2B2B"/>
-          <w:sz w:val="21"/>
-          <w:szCs w:val="21"/>
-        </w:rPr>
-        <w:t xml:space="preserve">@elevenlabs/react-native; mic permissions on iOS (via app.json ios.infoPlist) and Android; streaming audio playback in Expo.</w:t>
+        <w:t xml:space="preserve">☐  7. Chart spike — victory-native</w:t>
+      </w:r>
+    </w:p>
+    <w:p>
+      <w:pPr>
+        <w:spacing w:after="70" w:line="280"/>
+      </w:pPr>
+      <w:r>
+        <w:rPr>
+          <w:b/>
+          <w:bCs/>
+          <w:color w:val="2B2B2B"/>
+          <w:sz w:val="21"/>
+          <w:szCs w:val="21"/>
+        </w:rPr>
+        <w:t xml:space="preserve">Reference: </w:t>
+      </w:r>
+      <w:r>
+        <w:rPr>
+          <w:color w:val="2B2B2B"/>
+          <w:sz w:val="21"/>
+          <w:szCs w:val="21"/>
+        </w:rPr>
+        <w:t xml:space="preserve">frontend/src/components/cycle-sync/insights/CycleOverviewCard.tsx — the simplest chart, good first target.</w:t>
       </w:r>
     </w:p>
     <w:p>
@@ -3163,7 +3298,7 @@
           <w:sz w:val="21"/>
           <w:szCs w:val="21"/>
         </w:rPr>
-        <w:t xml:space="preserve">A throwaway test screen that records/streams and plays back one exchange.</w:t>
+        <w:t xml:space="preserve">Rebuild the same chart, same data shape, in victory-native.</w:t>
       </w:r>
     </w:p>
     <w:p>
@@ -3186,7 +3321,36 @@
           <w:sz w:val="21"/>
           <w:szCs w:val="21"/>
         </w:rPr>
-        <w:t xml:space="preserve">Works on a real phone. If it fails, write the fallback decision in the team plan doc (most likely: AI chat ships as an in-app webview) and flag it to the founder before Item 19 is claimed.</w:t>
+        <w:t xml:space="preserve">Visually matches the web version side-by-side on device.</w:t>
+      </w:r>
+    </w:p>
+    <w:p>
+      <w:pPr>
+        <w:pStyle w:val="Heading1"/>
+        <w:spacing w:after="140" w:before="320"/>
+      </w:pPr>
+      <w:r>
+        <w:rPr>
+          <w:b/>
+          <w:bCs/>
+          <w:color w:val="7A5C3E"/>
+          <w:sz w:val="30"/>
+          <w:szCs w:val="30"/>
+        </w:rPr>
+        <w:t xml:space="preserve">Phase 3 — Shared logic</w:t>
+      </w:r>
+    </w:p>
+    <w:p>
+      <w:pPr>
+        <w:spacing w:after="120" w:line="300"/>
+      </w:pPr>
+      <w:r>
+        <w:rPr>
+          <w:color w:val="2B2B2B"/>
+          <w:sz w:val="21"/>
+          <w:szCs w:val="21"/>
+        </w:rPr>
+        <w:t xml:space="preserve">Can start anytime; blocks nothing, but screens should switch to it once it lands.</w:t>
       </w:r>
     </w:p>
     <w:p>
@@ -3205,7 +3369,7 @@
           <w:sz w:val="23"/>
           <w:szCs w:val="23"/>
         </w:rPr>
-        <w:t xml:space="preserve">☐  7. Chart spike — victory-native</w:t>
+        <w:t xml:space="preserve">☐  8. Shared-logic package extraction</w:t>
       </w:r>
     </w:p>
     <w:p>
@@ -3228,7 +3392,7 @@
           <w:sz w:val="21"/>
           <w:szCs w:val="21"/>
         </w:rPr>
-        <w:t xml:space="preserve">frontend/src/components/cycle-sync/insights/CycleOverviewCard.tsx — the simplest chart, good first target.</w:t>
+        <w:t xml:space="preserve">shared/cycle/ (partially separated already) and frontend/src/lib/schemas.ts — anything with zero React/DOM imports is a candidate.</w:t>
       </w:r>
     </w:p>
     <w:p>
@@ -3251,7 +3415,7 @@
           <w:sz w:val="21"/>
           <w:szCs w:val="21"/>
         </w:rPr>
-        <w:t xml:space="preserve">Rebuild the same chart, same data shape, in victory-native.</w:t>
+        <w:t xml:space="preserve">Extend the shared/ package, update frontend/’s imports to point at it, run the full existing test suite.</w:t>
       </w:r>
     </w:p>
     <w:p>
@@ -3274,7 +3438,12 @@
           <w:sz w:val="21"/>
           <w:szCs w:val="21"/>
         </w:rPr>
-        <w:t xml:space="preserve">Visually matches the web version side-by-side on device.</w:t>
+        <w:t xml:space="preserve">The website builds and every existing test still passes. Screen-builders may temporarily copy the logic they need and switch the import later — don’t block on this.</w:t>
+      </w:r>
+    </w:p>
+    <w:p>
+      <w:r>
+        <w:br w:type="page"/>
       </w:r>
     </w:p>
     <w:p>
@@ -3290,7 +3459,7 @@
           <w:sz w:val="30"/>
           <w:szCs w:val="30"/>
         </w:rPr>
-        <w:t xml:space="preserve">Phase 3 — Shared logic</w:t>
+        <w:t xml:space="preserve">Phase 4 — Screens</w:t>
       </w:r>
     </w:p>
     <w:p>
@@ -3303,7 +3472,7 @@
           <w:sz w:val="21"/>
           <w:szCs w:val="21"/>
         </w:rPr>
-        <w:t xml:space="preserve">Can start anytime; blocks nothing, but screens should switch to it once it lands.</w:t>
+        <w:t xml:space="preserve">Each item needs Items 1, 4, 5 done. Phase-aware screens also need Item 8 (or a temporary copy of its logic). For every item, the reference page in frontend/src/app/cycle-sync/ is the spec — read it fully before writing any native code.</w:t>
       </w:r>
     </w:p>
     <w:p>
@@ -3322,7 +3491,30 @@
           <w:sz w:val="23"/>
           <w:szCs w:val="23"/>
         </w:rPr>
-        <w:t xml:space="preserve">☐  8. Shared-logic package extraction</w:t>
+        <w:t xml:space="preserve">☐  9. Home hub (dashboard)</w:t>
+      </w:r>
+    </w:p>
+    <w:p>
+      <w:pPr>
+        <w:spacing w:after="120" w:line="300"/>
+      </w:pPr>
+      <w:r>
+        <w:rPr>
+          <w:b/>
+          <w:bCs/>
+          <w:color w:val="2B2B2B"/>
+          <w:sz w:val="21"/>
+          <w:szCs w:val="21"/>
+        </w:rPr>
+        <w:t xml:space="preserve">Note: </w:t>
+      </w:r>
+      <w:r>
+        <w:rPr>
+          <w:color w:val="2B2B2B"/>
+          <w:sz w:val="21"/>
+          <w:szCs w:val="21"/>
+        </w:rPr>
+        <w:t xml:space="preserve">This screen was missing from the original plan — it’s the first thing a logged-in user sees.</w:t>
       </w:r>
     </w:p>
     <w:p>
@@ -3345,30 +3537,7 @@
           <w:sz w:val="21"/>
           <w:szCs w:val="21"/>
         </w:rPr>
-        <w:t xml:space="preserve">shared/cycle/ (partially separated already) and frontend/src/lib/schemas.ts — anything with zero React/DOM imports is a candidate.</w:t>
-      </w:r>
-    </w:p>
-    <w:p>
-      <w:pPr>
-        <w:spacing w:after="70" w:line="280"/>
-      </w:pPr>
-      <w:r>
-        <w:rPr>
-          <w:b/>
-          <w:bCs/>
-          <w:color w:val="2B2B2B"/>
-          <w:sz w:val="21"/>
-          <w:szCs w:val="21"/>
-        </w:rPr>
-        <w:t xml:space="preserve">Build: </w:t>
-      </w:r>
-      <w:r>
-        <w:rPr>
-          <w:color w:val="2B2B2B"/>
-          <w:sz w:val="21"/>
-          <w:szCs w:val="21"/>
-        </w:rPr>
-        <w:t xml:space="preserve">Extend the shared/ package, update frontend/’s imports to point at it, run the full existing test suite.</w:t>
+        <w:t xml:space="preserve">frontend/src/app/cycle-sync/page.tsx (the “Daily Flow River”), RiverTrack.tsx, WelcomeTour.tsx, ProfileAvatar.tsx.</w:t>
       </w:r>
     </w:p>
     <w:p>
@@ -3391,41 +3560,7 @@
           <w:sz w:val="21"/>
           <w:szCs w:val="21"/>
         </w:rPr>
-        <w:t xml:space="preserve">The website builds and every existing test still passes. Screen-builders may temporarily copy the logic they need and switch the import later — don’t block on this.</w:t>
-      </w:r>
-    </w:p>
-    <w:p>
-      <w:r>
-        <w:br w:type="page"/>
-      </w:r>
-    </w:p>
-    <w:p>
-      <w:pPr>
-        <w:pStyle w:val="Heading1"/>
-        <w:spacing w:after="140" w:before="320"/>
-      </w:pPr>
-      <w:r>
-        <w:rPr>
-          <w:b/>
-          <w:bCs/>
-          <w:color w:val="7A5C3E"/>
-          <w:sz w:val="30"/>
-          <w:szCs w:val="30"/>
-        </w:rPr>
-        <w:t xml:space="preserve">Phase 4 — Screens</w:t>
-      </w:r>
-    </w:p>
-    <w:p>
-      <w:pPr>
-        <w:spacing w:after="120" w:line="300"/>
-      </w:pPr>
-      <w:r>
-        <w:rPr>
-          <w:color w:val="2B2B2B"/>
-          <w:sz w:val="21"/>
-          <w:szCs w:val="21"/>
-        </w:rPr>
-        <w:t xml:space="preserve">Each item needs Items 1, 4, 5 done. Phase-aware screens also need Item 8 (or a temporary copy of its logic). For every item, the reference page in frontend/src/app/cycle-sync/ is the spec — read it fully before writing any native code.</w:t>
+        <w:t xml:space="preserve">Side-by-side with the website, same data, checked in all four phases.</w:t>
       </w:r>
     </w:p>
     <w:p>
@@ -3444,30 +3579,7 @@
           <w:sz w:val="23"/>
           <w:szCs w:val="23"/>
         </w:rPr>
-        <w:t xml:space="preserve">☐  9. Home hub (dashboard)</w:t>
-      </w:r>
-    </w:p>
-    <w:p>
-      <w:pPr>
-        <w:spacing w:after="120" w:line="300"/>
-      </w:pPr>
-      <w:r>
-        <w:rPr>
-          <w:b/>
-          <w:bCs/>
-          <w:color w:val="2B2B2B"/>
-          <w:sz w:val="21"/>
-          <w:szCs w:val="21"/>
-        </w:rPr>
-        <w:t xml:space="preserve">Note: </w:t>
-      </w:r>
-      <w:r>
-        <w:rPr>
-          <w:color w:val="2B2B2B"/>
-          <w:sz w:val="21"/>
-          <w:szCs w:val="21"/>
-        </w:rPr>
-        <w:t xml:space="preserve">This screen was missing from the original plan — it’s the first thing a logged-in user sees.</w:t>
+        <w:t xml:space="preserve">☐  10. Tracker — shell + first 6 logging cards</w:t>
       </w:r>
     </w:p>
     <w:p>
@@ -3490,7 +3602,7 @@
           <w:sz w:val="21"/>
           <w:szCs w:val="21"/>
         </w:rPr>
-        <w:t xml:space="preserve">frontend/src/app/cycle-sync/page.tsx (the “Daily Flow River”), RiverTrack.tsx, WelcomeTour.tsx, ProfileAvatar.tsx.</w:t>
+        <w:t xml:space="preserve">frontend/src/app/cycle-sync/tracker/page.tsx and .../tracker/components/ (18 cards total — split in two so nobody is blocked 4 days straight). Take Header, CalendarCard, CurrentPhaseBadge, FlowCard, PeriodLoggingCard, QuickPhaseLog.</w:t>
       </w:r>
     </w:p>
     <w:p>
@@ -3513,7 +3625,7 @@
           <w:sz w:val="21"/>
           <w:szCs w:val="21"/>
         </w:rPr>
-        <w:t xml:space="preserve">Side-by-side with the website, same data, checked in all four phases.</w:t>
+        <w:t xml:space="preserve">These 6 cards render and save correctly against a real account, in all four phases.</w:t>
       </w:r>
     </w:p>
     <w:p>
@@ -3532,7 +3644,7 @@
           <w:sz w:val="23"/>
           <w:szCs w:val="23"/>
         </w:rPr>
-        <w:t xml:space="preserve">☐  10. Tracker — shell + first 6 logging cards</w:t>
+        <w:t xml:space="preserve">☐  11. Tracker — remaining 12 logging cards</w:t>
       </w:r>
     </w:p>
     <w:p>
@@ -3555,7 +3667,30 @@
           <w:sz w:val="21"/>
           <w:szCs w:val="21"/>
         </w:rPr>
-        <w:t xml:space="preserve">frontend/src/app/cycle-sync/tracker/page.tsx and .../tracker/components/ (18 cards total — split in two so nobody is blocked 4 days straight). Take Header, CalendarCard, CurrentPhaseBadge, FlowCard, PeriodLoggingCard, QuickPhaseLog.</w:t>
+        <w:t xml:space="preserve">Same folder as Item 10: MoodsCard, SleepCard, SymptomsCard, WaterIntakeCard, ExerciseCard, DischargeCard, DisruptorsCard, NoteCard, SelfLoveCard, SexualWellnessCard, EditCycleBanner, SaveButton, plus TrackerAccordion wiring.</w:t>
+      </w:r>
+    </w:p>
+    <w:p>
+      <w:pPr>
+        <w:spacing w:after="70" w:line="280"/>
+      </w:pPr>
+      <w:r>
+        <w:rPr>
+          <w:b/>
+          <w:bCs/>
+          <w:color w:val="2B2B2B"/>
+          <w:sz w:val="21"/>
+          <w:szCs w:val="21"/>
+        </w:rPr>
+        <w:t xml:space="preserve">Depends on: </w:t>
+      </w:r>
+      <w:r>
+        <w:rPr>
+          <w:color w:val="2B2B2B"/>
+          <w:sz w:val="21"/>
+          <w:szCs w:val="21"/>
+        </w:rPr>
+        <w:t xml:space="preserve">Item 10 (shares the same screen shell).</w:t>
       </w:r>
     </w:p>
     <w:p>
@@ -3578,7 +3713,7 @@
           <w:sz w:val="21"/>
           <w:szCs w:val="21"/>
         </w:rPr>
-        <w:t xml:space="preserve">These 6 cards render and save correctly against a real account, in all four phases.</w:t>
+        <w:t xml:space="preserve">Full tracker matches the website card-for-card, all four phases, saves persist correctly.</w:t>
       </w:r>
     </w:p>
     <w:p>
@@ -3597,7 +3732,7 @@
           <w:sz w:val="23"/>
           <w:szCs w:val="23"/>
         </w:rPr>
-        <w:t xml:space="preserve">☐  11. Tracker — remaining 12 logging cards</w:t>
+        <w:t xml:space="preserve">☐  12. Plan (overview)</w:t>
       </w:r>
     </w:p>
     <w:p>
@@ -3620,30 +3755,7 @@
           <w:sz w:val="21"/>
           <w:szCs w:val="21"/>
         </w:rPr>
-        <w:t xml:space="preserve">Same folder as Item 10: MoodsCard, SleepCard, SymptomsCard, WaterIntakeCard, ExerciseCard, DischargeCard, DisruptorsCard, NoteCard, SelfLoveCard, SexualWellnessCard, EditCycleBanner, SaveButton, plus TrackerAccordion wiring.</w:t>
-      </w:r>
-    </w:p>
-    <w:p>
-      <w:pPr>
-        <w:spacing w:after="70" w:line="280"/>
-      </w:pPr>
-      <w:r>
-        <w:rPr>
-          <w:b/>
-          <w:bCs/>
-          <w:color w:val="2B2B2B"/>
-          <w:sz w:val="21"/>
-          <w:szCs w:val="21"/>
-        </w:rPr>
-        <w:t xml:space="preserve">Depends on: </w:t>
-      </w:r>
-      <w:r>
-        <w:rPr>
-          <w:color w:val="2B2B2B"/>
-          <w:sz w:val="21"/>
-          <w:szCs w:val="21"/>
-        </w:rPr>
-        <w:t xml:space="preserve">Item 10 (shares the same screen shell).</w:t>
+        <w:t xml:space="preserve">frontend/src/app/cycle-sync/plan/page.tsx. Links out to Rove Chef, Exercise builder, and Workout history — those are separate items (14/23/24); build just the overview here.</w:t>
       </w:r>
     </w:p>
     <w:p>
@@ -3666,7 +3778,7 @@
           <w:sz w:val="21"/>
           <w:szCs w:val="21"/>
         </w:rPr>
-        <w:t xml:space="preserve">Full tracker matches the website card-for-card, all four phases, saves persist correctly.</w:t>
+        <w:t xml:space="preserve">Side-by-side check, all four phases.</w:t>
       </w:r>
     </w:p>
     <w:p>
@@ -3685,7 +3797,7 @@
           <w:sz w:val="23"/>
           <w:szCs w:val="23"/>
         </w:rPr>
-        <w:t xml:space="preserve">☐  12. Plan (overview)</w:t>
+        <w:t xml:space="preserve">☐  13. Plan phase detail</w:t>
       </w:r>
     </w:p>
     <w:p>
@@ -3708,7 +3820,7 @@
           <w:sz w:val="21"/>
           <w:szCs w:val="21"/>
         </w:rPr>
-        <w:t xml:space="preserve">frontend/src/app/cycle-sync/plan/page.tsx. Links out to Rove Chef, Exercise builder, and Workout history — those are separate items (14/23/24); build just the overview here.</w:t>
+        <w:t xml:space="preserve">frontend/src/app/cycle-sync/plan/[phase]/page.tsx — one template, four phases, driven by phase-data and PHASE_ACCENT. Also review .../plan/[phase]/components/ExerciseDemo.tsx.</w:t>
       </w:r>
     </w:p>
     <w:p>
@@ -3731,7 +3843,7 @@
           <w:sz w:val="21"/>
           <w:szCs w:val="21"/>
         </w:rPr>
-        <w:t xml:space="preserve">Side-by-side check, all four phases.</w:t>
+        <w:t xml:space="preserve">All four phase variants checked individually against the website.</w:t>
       </w:r>
     </w:p>
     <w:p>
@@ -3750,7 +3862,7 @@
           <w:sz w:val="23"/>
           <w:szCs w:val="23"/>
         </w:rPr>
-        <w:t xml:space="preserve">☐  13. Plan phase detail</w:t>
+        <w:t xml:space="preserve">☐  14. Plan setup wizard</w:t>
       </w:r>
     </w:p>
     <w:p>
@@ -3773,7 +3885,7 @@
           <w:sz w:val="21"/>
           <w:szCs w:val="21"/>
         </w:rPr>
-        <w:t xml:space="preserve">frontend/src/app/cycle-sync/plan/[phase]/page.tsx — one template, four phases, driven by phase-data and PHASE_ACCENT. Also review .../plan/[phase]/components/ExerciseDemo.tsx.</w:t>
+        <w:t xml:space="preserve">frontend/src/components/cycle-sync/PlanSetupWizard.tsx.</w:t>
       </w:r>
     </w:p>
     <w:p>
@@ -3796,7 +3908,7 @@
           <w:sz w:val="21"/>
           <w:szCs w:val="21"/>
         </w:rPr>
-        <w:t xml:space="preserve">All four phase variants checked individually against the website.</w:t>
+        <w:t xml:space="preserve">Completing the wizard on a test account produces the same saved plan data as the website.</w:t>
       </w:r>
     </w:p>
     <w:p>
@@ -3815,7 +3927,7 @@
           <w:sz w:val="23"/>
           <w:szCs w:val="23"/>
         </w:rPr>
-        <w:t xml:space="preserve">☐  14. Plan setup wizard</w:t>
+        <w:t xml:space="preserve">☐  15. Insights</w:t>
       </w:r>
     </w:p>
     <w:p>
@@ -3838,7 +3950,30 @@
           <w:sz w:val="21"/>
           <w:szCs w:val="21"/>
         </w:rPr>
-        <w:t xml:space="preserve">frontend/src/components/cycle-sync/PlanSetupWizard.tsx.</w:t>
+        <w:t xml:space="preserve">frontend/src/app/cycle-sync/insights/page.tsx + all 5 cards in frontend/src/components/cycle-sync/insights/.</w:t>
+      </w:r>
+    </w:p>
+    <w:p>
+      <w:pPr>
+        <w:spacing w:after="70" w:line="280"/>
+      </w:pPr>
+      <w:r>
+        <w:rPr>
+          <w:b/>
+          <w:bCs/>
+          <w:color w:val="2B2B2B"/>
+          <w:sz w:val="21"/>
+          <w:szCs w:val="21"/>
+        </w:rPr>
+        <w:t xml:space="preserve">Depends on: </w:t>
+      </w:r>
+      <w:r>
+        <w:rPr>
+          <w:color w:val="2B2B2B"/>
+          <w:sz w:val="21"/>
+          <w:szCs w:val="21"/>
+        </w:rPr>
+        <w:t xml:space="preserve">Item 7 (chart spike) resolved.</w:t>
       </w:r>
     </w:p>
     <w:p>
@@ -3861,7 +3996,7 @@
           <w:sz w:val="21"/>
           <w:szCs w:val="21"/>
         </w:rPr>
-        <w:t xml:space="preserve">Completing the wizard on a test account produces the same saved plan data as the website.</w:t>
+        <w:t xml:space="preserve">All 5 cards render real data matching the website.</w:t>
       </w:r>
     </w:p>
     <w:p>
@@ -3880,7 +4015,7 @@
           <w:sz w:val="23"/>
           <w:szCs w:val="23"/>
         </w:rPr>
-        <w:t xml:space="preserve">☐  15. Insights</w:t>
+        <w:t xml:space="preserve">☐  16. Learn (article library)</w:t>
       </w:r>
     </w:p>
     <w:p>
@@ -3903,30 +4038,7 @@
           <w:sz w:val="21"/>
           <w:szCs w:val="21"/>
         </w:rPr>
-        <w:t xml:space="preserve">frontend/src/app/cycle-sync/insights/page.tsx + all 5 cards in frontend/src/components/cycle-sync/insights/.</w:t>
-      </w:r>
-    </w:p>
-    <w:p>
-      <w:pPr>
-        <w:spacing w:after="70" w:line="280"/>
-      </w:pPr>
-      <w:r>
-        <w:rPr>
-          <w:b/>
-          <w:bCs/>
-          <w:color w:val="2B2B2B"/>
-          <w:sz w:val="21"/>
-          <w:szCs w:val="21"/>
-        </w:rPr>
-        <w:t xml:space="preserve">Depends on: </w:t>
-      </w:r>
-      <w:r>
-        <w:rPr>
-          <w:color w:val="2B2B2B"/>
-          <w:sz w:val="21"/>
-          <w:szCs w:val="21"/>
-        </w:rPr>
-        <w:t xml:space="preserve">Item 7 (chart spike) resolved.</w:t>
+        <w:t xml:space="preserve">frontend/src/app/cycle-sync/learn/page.tsx + frontend/src/components/cycle-sync/learn/ (LearnHero, ContentRow, ArticleCard, LearnSkeleton).</w:t>
       </w:r>
     </w:p>
     <w:p>
@@ -3949,7 +4061,7 @@
           <w:sz w:val="21"/>
           <w:szCs w:val="21"/>
         </w:rPr>
-        <w:t xml:space="preserve">All 5 cards render real data matching the website.</w:t>
+        <w:t xml:space="preserve">Article list matches website; loading skeleton works.</w:t>
       </w:r>
     </w:p>
     <w:p>
@@ -3968,7 +4080,7 @@
           <w:sz w:val="23"/>
           <w:szCs w:val="23"/>
         </w:rPr>
-        <w:t xml:space="preserve">☐  16. Learn (article library)</w:t>
+        <w:t xml:space="preserve">☐  17. Learn article reader</w:t>
       </w:r>
     </w:p>
     <w:p>
@@ -3991,7 +4103,30 @@
           <w:sz w:val="21"/>
           <w:szCs w:val="21"/>
         </w:rPr>
-        <w:t xml:space="preserve">frontend/src/app/cycle-sync/learn/page.tsx + frontend/src/components/cycle-sync/learn/ (LearnHero, ContentRow, ArticleCard, LearnSkeleton).</w:t>
+        <w:t xml:space="preserve">frontend/src/app/cycle-sync/learn/[id]/page.tsx, ArticleControls.tsx, ArticleTracker.tsx.</w:t>
+      </w:r>
+    </w:p>
+    <w:p>
+      <w:pPr>
+        <w:spacing w:after="70" w:line="280"/>
+      </w:pPr>
+      <w:r>
+        <w:rPr>
+          <w:b/>
+          <w:bCs/>
+          <w:color w:val="2B2B2B"/>
+          <w:sz w:val="21"/>
+          <w:szCs w:val="21"/>
+        </w:rPr>
+        <w:t xml:space="preserve">Research: </w:t>
+      </w:r>
+      <w:r>
+        <w:rPr>
+          <w:color w:val="2B2B2B"/>
+          <w:sz w:val="21"/>
+          <w:szCs w:val="21"/>
+        </w:rPr>
+        <w:t xml:space="preserve">react-native-markdown-display for article body content.</w:t>
       </w:r>
     </w:p>
     <w:p>
@@ -4014,7 +4149,7 @@
           <w:sz w:val="21"/>
           <w:szCs w:val="21"/>
         </w:rPr>
-        <w:t xml:space="preserve">Article list matches website; loading skeleton works.</w:t>
+        <w:t xml:space="preserve">Open an article from Item 16, content renders correctly, reading-progress tracking works.</w:t>
       </w:r>
     </w:p>
     <w:p>
@@ -4033,7 +4168,7 @@
           <w:sz w:val="23"/>
           <w:szCs w:val="23"/>
         </w:rPr>
-        <w:t xml:space="preserve">☐  17. Learn article reader</w:t>
+        <w:t xml:space="preserve">☐  18. Profile</w:t>
       </w:r>
     </w:p>
     <w:p>
@@ -4056,30 +4191,7 @@
           <w:sz w:val="21"/>
           <w:szCs w:val="21"/>
         </w:rPr>
-        <w:t xml:space="preserve">frontend/src/app/cycle-sync/learn/[id]/page.tsx, ArticleControls.tsx, ArticleTracker.tsx.</w:t>
-      </w:r>
-    </w:p>
-    <w:p>
-      <w:pPr>
-        <w:spacing w:after="70" w:line="280"/>
-      </w:pPr>
-      <w:r>
-        <w:rPr>
-          <w:b/>
-          <w:bCs/>
-          <w:color w:val="2B2B2B"/>
-          <w:sz w:val="21"/>
-          <w:szCs w:val="21"/>
-        </w:rPr>
-        <w:t xml:space="preserve">Research: </w:t>
-      </w:r>
-      <w:r>
-        <w:rPr>
-          <w:color w:val="2B2B2B"/>
-          <w:sz w:val="21"/>
-          <w:szCs w:val="21"/>
-        </w:rPr>
-        <w:t xml:space="preserve">react-native-markdown-display for article body content.</w:t>
+        <w:t xml:space="preserve">frontend/src/app/cycle-sync/profile/page.tsx + all of .../profile/components/ (AccountSettings, CycleSignature, HealthPassport, LuxurySelect) — three real sub-sections, not one flat screen.</w:t>
       </w:r>
     </w:p>
     <w:p>
@@ -4102,7 +4214,7 @@
           <w:sz w:val="21"/>
           <w:szCs w:val="21"/>
         </w:rPr>
-        <w:t xml:space="preserve">Open an article from Item 16, content renders correctly, reading-progress tracking works.</w:t>
+        <w:t xml:space="preserve">Each sub-section works and matches the website with real account data.</w:t>
       </w:r>
     </w:p>
     <w:p>
@@ -4121,7 +4233,7 @@
           <w:sz w:val="23"/>
           <w:szCs w:val="23"/>
         </w:rPr>
-        <w:t xml:space="preserve">☐  18. Profile</w:t>
+        <w:t xml:space="preserve">☐  19. AI chat with voice</w:t>
       </w:r>
     </w:p>
     <w:p>
@@ -4144,7 +4256,53 @@
           <w:sz w:val="21"/>
           <w:szCs w:val="21"/>
         </w:rPr>
-        <w:t xml:space="preserve">frontend/src/app/cycle-sync/profile/page.tsx + all of .../profile/components/ (AccountSettings, CycleSignature, HealthPassport, LuxurySelect) — three real sub-sections, not one flat screen.</w:t>
+        <w:t xml:space="preserve">frontend/src/components/cycle-sync/ChatInterface.tsx (905 lines — largest component in the app) and ChatWidget.tsx (a floating button on every core screen, not a menu item). StructuredResponseRenderer.tsx shows response formatting.</w:t>
+      </w:r>
+    </w:p>
+    <w:p>
+      <w:pPr>
+        <w:spacing w:after="70" w:line="280"/>
+      </w:pPr>
+      <w:r>
+        <w:rPr>
+          <w:b/>
+          <w:bCs/>
+          <w:color w:val="2B2B2B"/>
+          <w:sz w:val="21"/>
+          <w:szCs w:val="21"/>
+        </w:rPr>
+        <w:t xml:space="preserve">Research: </w:t>
+      </w:r>
+      <w:r>
+        <w:rPr>
+          <w:color w:val="2B2B2B"/>
+          <w:sz w:val="21"/>
+          <w:szCs w:val="21"/>
+        </w:rPr>
+        <w:t xml:space="preserve">Calls the existing /api/ai-chat and /api/chat routes on rovehealth.in — no backend work needed.</w:t>
+      </w:r>
+    </w:p>
+    <w:p>
+      <w:pPr>
+        <w:spacing w:after="70" w:line="280"/>
+      </w:pPr>
+      <w:r>
+        <w:rPr>
+          <w:b/>
+          <w:bCs/>
+          <w:color w:val="2B2B2B"/>
+          <w:sz w:val="21"/>
+          <w:szCs w:val="21"/>
+        </w:rPr>
+        <w:t xml:space="preserve">Depends on: </w:t>
+      </w:r>
+      <w:r>
+        <w:rPr>
+          <w:color w:val="2B2B2B"/>
+          <w:sz w:val="21"/>
+          <w:szCs w:val="21"/>
+        </w:rPr>
+        <w:t xml:space="preserve">Item 6 (voice spike), including its fallback decision if voice failed.</w:t>
       </w:r>
     </w:p>
     <w:p>
@@ -4167,7 +4325,7 @@
           <w:sz w:val="21"/>
           <w:szCs w:val="21"/>
         </w:rPr>
-        <w:t xml:space="preserve">Each sub-section works and matches the website with real account data.</w:t>
+        <w:t xml:space="preserve">A full conversation round-trips correctly, matches web behavior, voice works (or the agreed webview fallback is in place).</w:t>
       </w:r>
     </w:p>
     <w:p>
@@ -4186,7 +4344,7 @@
           <w:sz w:val="23"/>
           <w:szCs w:val="23"/>
         </w:rPr>
-        <w:t xml:space="preserve">☐  19. AI chat with voice</w:t>
+        <w:t xml:space="preserve">☐  20. Wellbeing intro</w:t>
       </w:r>
     </w:p>
     <w:p>
@@ -4209,53 +4367,7 @@
           <w:sz w:val="21"/>
           <w:szCs w:val="21"/>
         </w:rPr>
-        <w:t xml:space="preserve">frontend/src/components/cycle-sync/ChatInterface.tsx (905 lines — largest component in the app) and ChatWidget.tsx (a floating button on every core screen, not a menu item). StructuredResponseRenderer.tsx shows response formatting.</w:t>
-      </w:r>
-    </w:p>
-    <w:p>
-      <w:pPr>
-        <w:spacing w:after="70" w:line="280"/>
-      </w:pPr>
-      <w:r>
-        <w:rPr>
-          <w:b/>
-          <w:bCs/>
-          <w:color w:val="2B2B2B"/>
-          <w:sz w:val="21"/>
-          <w:szCs w:val="21"/>
-        </w:rPr>
-        <w:t xml:space="preserve">Research: </w:t>
-      </w:r>
-      <w:r>
-        <w:rPr>
-          <w:color w:val="2B2B2B"/>
-          <w:sz w:val="21"/>
-          <w:szCs w:val="21"/>
-        </w:rPr>
-        <w:t xml:space="preserve">Calls the existing /api/ai-chat and /api/chat routes on rovehealth.in — no backend work needed.</w:t>
-      </w:r>
-    </w:p>
-    <w:p>
-      <w:pPr>
-        <w:spacing w:after="70" w:line="280"/>
-      </w:pPr>
-      <w:r>
-        <w:rPr>
-          <w:b/>
-          <w:bCs/>
-          <w:color w:val="2B2B2B"/>
-          <w:sz w:val="21"/>
-          <w:szCs w:val="21"/>
-        </w:rPr>
-        <w:t xml:space="preserve">Depends on: </w:t>
-      </w:r>
-      <w:r>
-        <w:rPr>
-          <w:color w:val="2B2B2B"/>
-          <w:sz w:val="21"/>
-          <w:szCs w:val="21"/>
-        </w:rPr>
-        <w:t xml:space="preserve">Item 6 (voice spike), including its fallback decision if voice failed.</w:t>
+        <w:t xml:space="preserve">frontend/src/app/cycle-sync/wellbeing/intro/page.tsx.</w:t>
       </w:r>
     </w:p>
     <w:p>
@@ -4278,7 +4390,7 @@
           <w:sz w:val="21"/>
           <w:szCs w:val="21"/>
         </w:rPr>
-        <w:t xml:space="preserve">A full conversation round-trips correctly, matches web behavior, voice works (or the agreed webview fallback is in place).</w:t>
+        <w:t xml:space="preserve">Matches website.</w:t>
       </w:r>
     </w:p>
     <w:p>
@@ -4297,7 +4409,7 @@
           <w:sz w:val="23"/>
           <w:szCs w:val="23"/>
         </w:rPr>
-        <w:t xml:space="preserve">☐  20. Wellbeing intro</w:t>
+        <w:t xml:space="preserve">☐  21. Wellbeing assessment</w:t>
       </w:r>
     </w:p>
     <w:p>
@@ -4320,7 +4432,7 @@
           <w:sz w:val="21"/>
           <w:szCs w:val="21"/>
         </w:rPr>
-        <w:t xml:space="preserve">frontend/src/app/cycle-sync/wellbeing/intro/page.tsx.</w:t>
+        <w:t xml:space="preserve">frontend/src/app/cycle-sync/wellbeing/assessment/page.tsx — question-by-question flow with a progress bar.</w:t>
       </w:r>
     </w:p>
     <w:p>
@@ -4343,7 +4455,7 @@
           <w:sz w:val="21"/>
           <w:szCs w:val="21"/>
         </w:rPr>
-        <w:t xml:space="preserve">Matches website.</w:t>
+        <w:t xml:space="preserve">Completing the assessment on a test account saves the same result the website would.</w:t>
       </w:r>
     </w:p>
     <w:p>
@@ -4362,7 +4474,7 @@
           <w:sz w:val="23"/>
           <w:szCs w:val="23"/>
         </w:rPr>
-        <w:t xml:space="preserve">☐  21. Wellbeing assessment</w:t>
+        <w:t xml:space="preserve">☐  22. Rove Chef</w:t>
       </w:r>
     </w:p>
     <w:p>
@@ -4385,7 +4497,7 @@
           <w:sz w:val="21"/>
           <w:szCs w:val="21"/>
         </w:rPr>
-        <w:t xml:space="preserve">frontend/src/app/cycle-sync/wellbeing/assessment/page.tsx — question-by-question flow with a progress bar.</w:t>
+        <w:t xml:space="preserve">frontend/src/components/cycle-sync/RoveChef.tsx (552 lines) + frontend/src/components/cycle-sync/diet/ (DietCheatSheet, MacroFuelGauge, SymptomDecoder).</w:t>
       </w:r>
     </w:p>
     <w:p>
@@ -4408,7 +4520,7 @@
           <w:sz w:val="21"/>
           <w:szCs w:val="21"/>
         </w:rPr>
-        <w:t xml:space="preserve">Completing the assessment on a test account saves the same result the website would.</w:t>
+        <w:t xml:space="preserve">Matches website functionality for a test account.</w:t>
       </w:r>
     </w:p>
     <w:p>
@@ -4427,7 +4539,7 @@
           <w:sz w:val="23"/>
           <w:szCs w:val="23"/>
         </w:rPr>
-        <w:t xml:space="preserve">☐  22. Rove Chef</w:t>
+        <w:t xml:space="preserve">☐  23. Exercise builder</w:t>
       </w:r>
     </w:p>
     <w:p>
@@ -4450,7 +4562,7 @@
           <w:sz w:val="21"/>
           <w:szCs w:val="21"/>
         </w:rPr>
-        <w:t xml:space="preserve">frontend/src/components/cycle-sync/RoveChef.tsx (552 lines) + frontend/src/components/cycle-sync/diet/ (DietCheatSheet, MacroFuelGauge, SymptomDecoder).</w:t>
+        <w:t xml:space="preserve">frontend/src/components/cycle-sync/ExerciseBuilder.tsx (475 lines), ExerciseOrb.tsx.</w:t>
       </w:r>
     </w:p>
     <w:p>
@@ -4473,7 +4585,7 @@
           <w:sz w:val="21"/>
           <w:szCs w:val="21"/>
         </w:rPr>
-        <w:t xml:space="preserve">Matches website functionality for a test account.</w:t>
+        <w:t xml:space="preserve">Matches website.</w:t>
       </w:r>
     </w:p>
     <w:p>
@@ -4492,7 +4604,7 @@
           <w:sz w:val="23"/>
           <w:szCs w:val="23"/>
         </w:rPr>
-        <w:t xml:space="preserve">☐  23. Exercise builder</w:t>
+        <w:t xml:space="preserve">☐  24. Workout history</w:t>
       </w:r>
     </w:p>
     <w:p>
@@ -4515,7 +4627,7 @@
           <w:sz w:val="21"/>
           <w:szCs w:val="21"/>
         </w:rPr>
-        <w:t xml:space="preserve">frontend/src/components/cycle-sync/ExerciseBuilder.tsx (475 lines), ExerciseOrb.tsx.</w:t>
+        <w:t xml:space="preserve">frontend/src/components/cycle-sync/WorkoutHistory.tsx (491 lines), WeightProgressCard.tsx.</w:t>
       </w:r>
     </w:p>
     <w:p>
@@ -4538,7 +4650,7 @@
           <w:sz w:val="21"/>
           <w:szCs w:val="21"/>
         </w:rPr>
-        <w:t xml:space="preserve">Matches website.</w:t>
+        <w:t xml:space="preserve">Matches website with real account data.</w:t>
       </w:r>
     </w:p>
     <w:p>
@@ -4557,7 +4669,7 @@
           <w:sz w:val="23"/>
           <w:szCs w:val="23"/>
         </w:rPr>
-        <w:t xml:space="preserve">☐  24. Workout history</w:t>
+        <w:t xml:space="preserve">☐  25. Guided workout session player</w:t>
       </w:r>
     </w:p>
     <w:p>
@@ -4580,7 +4692,7 @@
           <w:sz w:val="21"/>
           <w:szCs w:val="21"/>
         </w:rPr>
-        <w:t xml:space="preserve">frontend/src/components/cycle-sync/WorkoutHistory.tsx (491 lines), WeightProgressCard.tsx.</w:t>
+        <w:t xml:space="preserve">frontend/src/app/cycle-sync/plan/[phase]/components/GuidedSession.tsx — a full-screen player, dynamically loaded on web.</w:t>
       </w:r>
     </w:p>
     <w:p>
@@ -4603,7 +4715,7 @@
           <w:sz w:val="21"/>
           <w:szCs w:val="21"/>
         </w:rPr>
-        <w:t xml:space="preserve">Matches website with real account data.</w:t>
+        <w:t xml:space="preserve">A full guided session plays through correctly on device.</w:t>
       </w:r>
     </w:p>
     <w:p>
@@ -4622,7 +4734,7 @@
           <w:sz w:val="23"/>
           <w:szCs w:val="23"/>
         </w:rPr>
-        <w:t xml:space="preserve">☐  25. Guided workout session player</w:t>
+        <w:t xml:space="preserve">☐  26. Marketing webviews</w:t>
       </w:r>
     </w:p>
     <w:p>
@@ -4645,7 +4757,30 @@
           <w:sz w:val="21"/>
           <w:szCs w:val="21"/>
         </w:rPr>
-        <w:t xml:space="preserve">frontend/src/app/cycle-sync/plan/[phase]/components/GuidedSession.tsx — a full-screen player, dynamically loaded on web.</w:t>
+        <w:t xml:space="preserve">Shop, Science, Story, Ingredient glossary, Privacy, Privacy pledge.</w:t>
+      </w:r>
+    </w:p>
+    <w:p>
+      <w:pPr>
+        <w:spacing w:after="70" w:line="280"/>
+      </w:pPr>
+      <w:r>
+        <w:rPr>
+          <w:b/>
+          <w:bCs/>
+          <w:color w:val="2B2B2B"/>
+          <w:sz w:val="21"/>
+          <w:szCs w:val="21"/>
+        </w:rPr>
+        <w:t xml:space="preserve">Build: </w:t>
+      </w:r>
+      <w:r>
+        <w:rPr>
+          <w:color w:val="2B2B2B"/>
+          <w:sz w:val="21"/>
+          <w:szCs w:val="21"/>
+        </w:rPr>
+        <w:t xml:space="preserve">Per the main plan, build ONE reusable in-app browser screen pointed at the live URLs — not six separate native rebuilds.</w:t>
       </w:r>
     </w:p>
     <w:p>
@@ -4668,7 +4803,41 @@
           <w:sz w:val="21"/>
           <w:szCs w:val="21"/>
         </w:rPr>
-        <w:t xml:space="preserve">A full guided session plays through correctly on device.</w:t>
+        <w:t xml:space="preserve">A test shop order completes end-to-end inside the webview.</w:t>
+      </w:r>
+    </w:p>
+    <w:p>
+      <w:r>
+        <w:br w:type="page"/>
+      </w:r>
+    </w:p>
+    <w:p>
+      <w:pPr>
+        <w:pStyle w:val="Heading1"/>
+        <w:spacing w:after="140" w:before="320"/>
+      </w:pPr>
+      <w:r>
+        <w:rPr>
+          <w:b/>
+          <w:bCs/>
+          <w:color w:val="7A5C3E"/>
+          <w:sz w:val="30"/>
+          <w:szCs w:val="30"/>
+        </w:rPr>
+        <w:t xml:space="preserve">Phase 5 — Native polish</w:t>
+      </w:r>
+    </w:p>
+    <w:p>
+      <w:pPr>
+        <w:spacing w:after="120" w:line="300"/>
+      </w:pPr>
+      <w:r>
+        <w:rPr>
+          <w:color w:val="2B2B2B"/>
+          <w:sz w:val="21"/>
+          <w:szCs w:val="21"/>
+        </w:rPr>
+        <w:t xml:space="preserve">Claimable once most of Phase 4 is merged.</w:t>
       </w:r>
     </w:p>
     <w:p>
@@ -4687,7 +4856,7 @@
           <w:sz w:val="23"/>
           <w:szCs w:val="23"/>
         </w:rPr>
-        <w:t xml:space="preserve">☐  26. Marketing webviews</w:t>
+        <w:t xml:space="preserve">☐  27. Splash screen, status bar, app icons, offline caching, push scaffolding</w:t>
       </w:r>
     </w:p>
     <w:p>
@@ -4710,7 +4879,7 @@
           <w:sz w:val="21"/>
           <w:szCs w:val="21"/>
         </w:rPr>
-        <w:t xml:space="preserve">Shop, Science, Story, Ingredient glossary, Privacy, Privacy pledge.</w:t>
+        <w:t xml:space="preserve">frontend/capacitor.config.ts (splash/status bar colors to match) and resources/ (existing icon source files).</w:t>
       </w:r>
     </w:p>
     <w:p>
@@ -4733,7 +4902,7 @@
           <w:sz w:val="21"/>
           <w:szCs w:val="21"/>
         </w:rPr>
-        <w:t xml:space="preserve">Per the main plan, build ONE reusable in-app browser screen pointed at the live URLs — not six separate native rebuilds.</w:t>
+        <w:t xml:space="preserve">Splash + status bar parity, app icons, offline caching of learn content and last-known cycle data via MMKV + TanStack Query persist, push-notification scaffolding for phase reminders.</w:t>
       </w:r>
     </w:p>
     <w:p>
@@ -4756,41 +4925,7 @@
           <w:sz w:val="21"/>
           <w:szCs w:val="21"/>
         </w:rPr>
-        <w:t xml:space="preserve">A test shop order completes end-to-end inside the webview.</w:t>
-      </w:r>
-    </w:p>
-    <w:p>
-      <w:r>
-        <w:br w:type="page"/>
-      </w:r>
-    </w:p>
-    <w:p>
-      <w:pPr>
-        <w:pStyle w:val="Heading1"/>
-        <w:spacing w:after="140" w:before="320"/>
-      </w:pPr>
-      <w:r>
-        <w:rPr>
-          <w:b/>
-          <w:bCs/>
-          <w:color w:val="7A5C3E"/>
-          <w:sz w:val="30"/>
-          <w:szCs w:val="30"/>
-        </w:rPr>
-        <w:t xml:space="preserve">Phase 5 — Native polish</w:t>
-      </w:r>
-    </w:p>
-    <w:p>
-      <w:pPr>
-        <w:spacing w:after="120" w:line="300"/>
-      </w:pPr>
-      <w:r>
-        <w:rPr>
-          <w:color w:val="2B2B2B"/>
-          <w:sz w:val="21"/>
-          <w:szCs w:val="21"/>
-        </w:rPr>
-        <w:t xml:space="preserve">Claimable once most of Phase 4 is merged.</w:t>
+        <w:t xml:space="preserve">Airplane-mode test — app opens and shows cached data.</w:t>
       </w:r>
     </w:p>
     <w:p>
@@ -4809,30 +4944,7 @@
           <w:sz w:val="23"/>
           <w:szCs w:val="23"/>
         </w:rPr>
-        <w:t xml:space="preserve">☐  27. Splash screen, status bar, app icons, offline caching, push scaffolding</w:t>
-      </w:r>
-    </w:p>
-    <w:p>
-      <w:pPr>
-        <w:spacing w:after="70" w:line="280"/>
-      </w:pPr>
-      <w:r>
-        <w:rPr>
-          <w:b/>
-          <w:bCs/>
-          <w:color w:val="2B2B2B"/>
-          <w:sz w:val="21"/>
-          <w:szCs w:val="21"/>
-        </w:rPr>
-        <w:t xml:space="preserve">Reference: </w:t>
-      </w:r>
-      <w:r>
-        <w:rPr>
-          <w:color w:val="2B2B2B"/>
-          <w:sz w:val="21"/>
-          <w:szCs w:val="21"/>
-        </w:rPr>
-        <w:t xml:space="preserve">frontend/capacitor.config.ts (splash/status bar colors to match) and resources/ (existing icon source files).</w:t>
+        <w:t xml:space="preserve">☐  28. EAS build profiles + analytics/error reporting</w:t>
       </w:r>
     </w:p>
     <w:p>
@@ -4855,7 +4967,7 @@
           <w:sz w:val="21"/>
           <w:szCs w:val="21"/>
         </w:rPr>
-        <w:t xml:space="preserve">Splash + status bar parity, app icons, offline caching of learn content and last-known cycle data via MMKV + TanStack Query persist, push-notification scaffolding for phase reminders.</w:t>
+        <w:t xml:space="preserve">EAS build profiles (dev/preview/production), PostHog wired in (posthog-react-native), crash/error reporting.</w:t>
       </w:r>
     </w:p>
     <w:p>
@@ -4878,7 +4990,38 @@
           <w:sz w:val="21"/>
           <w:szCs w:val="21"/>
         </w:rPr>
-        <w:t xml:space="preserve">Airplane-mode test — app opens and shows cached data.</w:t>
+        <w:t xml:space="preserve">A preview build installs via EAS on a real device; a test event shows up in PostHog.</w:t>
+      </w:r>
+    </w:p>
+    <w:p>
+      <w:pPr>
+        <w:pStyle w:val="Heading1"/>
+        <w:spacing w:after="140" w:before="320"/>
+      </w:pPr>
+      <w:r>
+        <w:rPr>
+          <w:b/>
+          <w:bCs/>
+          <w:color w:val="7A5C3E"/>
+          <w:sz w:val="30"/>
+          <w:szCs w:val="30"/>
+        </w:rPr>
+        <w:t xml:space="preserve">Phase 6 — Testing and release</w:t>
+      </w:r>
+    </w:p>
+    <w:p>
+      <w:pPr>
+        <w:spacing w:after="120" w:line="300"/>
+      </w:pPr>
+      <w:r>
+        <w:rPr>
+          <w:b/>
+          <w:bCs/>
+          <w:color w:val="2B2B2B"/>
+          <w:sz w:val="21"/>
+          <w:szCs w:val="21"/>
+        </w:rPr>
+        <w:t xml:space="preserve">Whole team, after Phase 4 + 5 are merged. Do not compress this phase.</w:t>
       </w:r>
     </w:p>
     <w:p>
@@ -4897,7 +5040,53 @@
           <w:sz w:val="23"/>
           <w:szCs w:val="23"/>
         </w:rPr>
-        <w:t xml:space="preserve">☐  28. EAS build profiles + analytics/error reporting</w:t>
+        <w:t xml:space="preserve">☐  3. Play Store signing-key verification</w:t>
+      </w:r>
+    </w:p>
+    <w:p>
+      <w:pPr>
+        <w:spacing w:after="120" w:line="300"/>
+      </w:pPr>
+      <w:r>
+        <w:rPr>
+          <w:b/>
+          <w:bCs/>
+          <w:color w:val="2B2B2B"/>
+          <w:sz w:val="21"/>
+          <w:szCs w:val="21"/>
+        </w:rPr>
+        <w:t xml:space="preserve">Note: </w:t>
+      </w:r>
+      <w:r>
+        <w:rPr>
+          <w:color w:val="2B2B2B"/>
+          <w:sz w:val="21"/>
+          <w:szCs w:val="21"/>
+        </w:rPr>
+        <w:t xml:space="preserve">The one irreversible risk in the whole project. Deliberately deferred to this phase by founder decision (2026-07-19) — see Decisions log. Do this before the release build below, not after.</w:t>
+      </w:r>
+    </w:p>
+    <w:p>
+      <w:pPr>
+        <w:spacing w:after="70" w:line="280"/>
+      </w:pPr>
+      <w:r>
+        <w:rPr>
+          <w:b/>
+          <w:bCs/>
+          <w:color w:val="2B2B2B"/>
+          <w:sz w:val="21"/>
+          <w:szCs w:val="21"/>
+        </w:rPr>
+        <w:t xml:space="preserve">Research: </w:t>
+      </w:r>
+      <w:r>
+        <w:rPr>
+          <w:color w:val="2B2B2B"/>
+          <w:sz w:val="21"/>
+          <w:szCs w:val="21"/>
+        </w:rPr>
+        <w:t xml:space="preserve">Play Console → your app → Setup → App signing. Find the existing upload keystore for com.rovehealth.app.</w:t>
       </w:r>
     </w:p>
     <w:p>
@@ -4920,7 +5109,7 @@
           <w:sz w:val="21"/>
           <w:szCs w:val="21"/>
         </w:rPr>
-        <w:t xml:space="preserve">EAS build profiles (dev/preview/production), PostHog wired in (posthog-react-native), crash/error reporting.</w:t>
+        <w:t xml:space="preserve">No code — verify, then back up the keystore file in two separate places.</w:t>
       </w:r>
     </w:p>
     <w:p>
@@ -4943,38 +5132,7 @@
           <w:sz w:val="21"/>
           <w:szCs w:val="21"/>
         </w:rPr>
-        <w:t xml:space="preserve">A preview build installs via EAS on a real device; a test event shows up in PostHog.</w:t>
-      </w:r>
-    </w:p>
-    <w:p>
-      <w:pPr>
-        <w:pStyle w:val="Heading1"/>
-        <w:spacing w:after="140" w:before="320"/>
-      </w:pPr>
-      <w:r>
-        <w:rPr>
-          <w:b/>
-          <w:bCs/>
-          <w:color w:val="7A5C3E"/>
-          <w:sz w:val="30"/>
-          <w:szCs w:val="30"/>
-        </w:rPr>
-        <w:t xml:space="preserve">Phase 6 — Testing and release</w:t>
-      </w:r>
-    </w:p>
-    <w:p>
-      <w:pPr>
-        <w:spacing w:after="120" w:line="300"/>
-      </w:pPr>
-      <w:r>
-        <w:rPr>
-          <w:b/>
-          <w:bCs/>
-          <w:color w:val="2B2B2B"/>
-          <w:sz w:val="21"/>
-          <w:szCs w:val="21"/>
-        </w:rPr>
-        <w:t xml:space="preserve">Whole team, after Phase 4 + 5 are merged. Do not compress this phase.</w:t>
+        <w:t xml:space="preserve">A written note (shared with the founder) confirming where the keystore lives and that it is backed up twice.</w:t>
       </w:r>
     </w:p>
     <w:p>

</xml_diff>